<commit_message>
Add documents and modifiy Readme
</commit_message>
<xml_diff>
--- a/fil rouge dev2 (Infra)/Documentation/Active Directory.docx
+++ b/fil rouge dev2 (Infra)/Documentation/Active Directory.docx
@@ -747,8 +747,8 @@
         <w:tblLook w:val="04A0" w:firstRow="1" w:lastRow="0" w:firstColumn="1" w:lastColumn="0" w:noHBand="0" w:noVBand="1"/>
       </w:tblPr>
       <w:tblGrid>
-        <w:gridCol w:w="1743"/>
-        <w:gridCol w:w="2714"/>
+        <w:gridCol w:w="3402"/>
+        <w:gridCol w:w="3119"/>
       </w:tblGrid>
       <w:tr>
         <w:trPr>
@@ -757,7 +757,7 @@
         </w:trPr>
         <w:tc>
           <w:tcPr>
-            <w:tcW w:w="0" w:type="auto"/>
+            <w:tcW w:w="3357" w:type="dxa"/>
             <w:vAlign w:val="center"/>
             <w:hideMark/>
           </w:tcPr>
@@ -780,7 +780,7 @@
         </w:tc>
         <w:tc>
           <w:tcPr>
-            <w:tcW w:w="0" w:type="auto"/>
+            <w:tcW w:w="3074" w:type="dxa"/>
             <w:vAlign w:val="center"/>
             <w:hideMark/>
           </w:tcPr>
@@ -808,7 +808,7 @@
         </w:trPr>
         <w:tc>
           <w:tcPr>
-            <w:tcW w:w="0" w:type="auto"/>
+            <w:tcW w:w="3357" w:type="dxa"/>
             <w:vAlign w:val="center"/>
             <w:hideMark/>
           </w:tcPr>
@@ -817,13 +817,22 @@
               <w:jc w:val="both"/>
             </w:pPr>
             <w:r>
-              <w:t>\Serveur\RH</w:t>
+              <w:t>\</w:t>
+            </w:r>
+            <w:r>
+              <w:t xml:space="preserve"> </w:t>
+            </w:r>
+            <w:r>
+              <w:t>SRV-YPLAZA-DC01</w:t>
+            </w:r>
+            <w:r>
+              <w:t>\RH</w:t>
             </w:r>
           </w:p>
         </w:tc>
         <w:tc>
           <w:tcPr>
-            <w:tcW w:w="0" w:type="auto"/>
+            <w:tcW w:w="3074" w:type="dxa"/>
             <w:vAlign w:val="center"/>
             <w:hideMark/>
           </w:tcPr>
@@ -843,7 +852,7 @@
         </w:trPr>
         <w:tc>
           <w:tcPr>
-            <w:tcW w:w="0" w:type="auto"/>
+            <w:tcW w:w="3357" w:type="dxa"/>
             <w:vAlign w:val="center"/>
             <w:hideMark/>
           </w:tcPr>
@@ -852,13 +861,22 @@
               <w:jc w:val="both"/>
             </w:pPr>
             <w:r>
-              <w:t>\Serveur\Ventes</w:t>
+              <w:t>\</w:t>
+            </w:r>
+            <w:r>
+              <w:t xml:space="preserve"> </w:t>
+            </w:r>
+            <w:r>
+              <w:t>SRV-YPLAZA-DC01</w:t>
+            </w:r>
+            <w:r>
+              <w:t>\Ventes</w:t>
             </w:r>
           </w:p>
         </w:tc>
         <w:tc>
           <w:tcPr>
-            <w:tcW w:w="0" w:type="auto"/>
+            <w:tcW w:w="3074" w:type="dxa"/>
             <w:vAlign w:val="center"/>
             <w:hideMark/>
           </w:tcPr>
@@ -878,7 +896,7 @@
         </w:trPr>
         <w:tc>
           <w:tcPr>
-            <w:tcW w:w="0" w:type="auto"/>
+            <w:tcW w:w="3357" w:type="dxa"/>
             <w:vAlign w:val="center"/>
             <w:hideMark/>
           </w:tcPr>
@@ -887,13 +905,22 @@
               <w:jc w:val="both"/>
             </w:pPr>
             <w:r>
-              <w:t>\Serveur\Admin</w:t>
+              <w:t>\</w:t>
+            </w:r>
+            <w:r>
+              <w:t xml:space="preserve"> </w:t>
+            </w:r>
+            <w:r>
+              <w:t>SRV-YPLAZA-DC01</w:t>
+            </w:r>
+            <w:r>
+              <w:t>\Admin</w:t>
             </w:r>
           </w:p>
         </w:tc>
         <w:tc>
           <w:tcPr>
-            <w:tcW w:w="0" w:type="auto"/>
+            <w:tcW w:w="3074" w:type="dxa"/>
             <w:vAlign w:val="center"/>
             <w:hideMark/>
           </w:tcPr>
@@ -913,7 +940,7 @@
         </w:trPr>
         <w:tc>
           <w:tcPr>
-            <w:tcW w:w="0" w:type="auto"/>
+            <w:tcW w:w="3357" w:type="dxa"/>
             <w:vAlign w:val="center"/>
             <w:hideMark/>
           </w:tcPr>
@@ -922,13 +949,22 @@
               <w:jc w:val="both"/>
             </w:pPr>
             <w:r>
-              <w:t>\Serveur\Public</w:t>
+              <w:t>\</w:t>
+            </w:r>
+            <w:r>
+              <w:t xml:space="preserve"> </w:t>
+            </w:r>
+            <w:r>
+              <w:t>SRV-YPLAZA-DC01</w:t>
+            </w:r>
+            <w:r>
+              <w:t>\Public</w:t>
             </w:r>
           </w:p>
         </w:tc>
         <w:tc>
           <w:tcPr>
-            <w:tcW w:w="0" w:type="auto"/>
+            <w:tcW w:w="3074" w:type="dxa"/>
             <w:vAlign w:val="center"/>
             <w:hideMark/>
           </w:tcPr>
@@ -1045,6 +1081,19 @@
       </w:pPr>
       <w:r>
         <w:t>accès limité aux paramètres système</w:t>
+      </w:r>
+    </w:p>
+    <w:p>
+      <w:pPr>
+        <w:pStyle w:val="Paragraphedeliste"/>
+        <w:numPr>
+          <w:ilvl w:val="0"/>
+          <w:numId w:val="6"/>
+        </w:numPr>
+        <w:jc w:val="both"/>
+      </w:pPr>
+      <w:r>
+        <w:t>blocage du panneau de configuration</w:t>
       </w:r>
     </w:p>
     <w:p>
@@ -2750,7 +2799,6 @@
   <w:style w:type="character" w:default="1" w:styleId="Policepardfaut">
     <w:name w:val="Default Paragraph Font"/>
     <w:uiPriority w:val="1"/>
-    <w:semiHidden/>
     <w:unhideWhenUsed/>
   </w:style>
   <w:style w:type="table" w:default="1" w:styleId="TableauNormal">

</xml_diff>